<commit_message>
Add comprehensive unit tests for EAR/EEG/EOG blink features
</commit_message>
<xml_diff>
--- a/Python Code Inspection Guidelines.docx
+++ b/Python Code Inspection Guidelines.docx
@@ -68,7 +68,22 @@
         <w:t>compute pipelines</w:t>
       </w:r>
       <w:r>
-        <w:t xml:space="preserve"> used across morphology, kinematic and frequency‑domain feature extractors.</w:t>
+        <w:t xml:space="preserve"> used across morphology, kinematic </w:t>
+      </w:r>
+      <w:r>
+        <w:rPr>
+          <w:lang w:val="en-US"/>
+        </w:rPr>
+        <w:t>energy</w:t>
+      </w:r>
+      <w:r>
+        <w:rPr>
+          <w:lang w:val="en-US"/>
+        </w:rPr>
+        <w:t xml:space="preserve">, and </w:t>
+      </w:r>
+      <w:r>
+        <w:t>frequency‑domain feature extractors.</w:t>
       </w:r>
     </w:p>
     <w:p>
@@ -322,14 +337,8 @@
               <w:rPr>
                 <w:rStyle w:val="VerbatimChar"/>
               </w:rPr>
-              <w:t>blink_features/kinemati</w:t>
-            </w:r>
-            <w:r>
-              <w:rPr>
-                <w:rStyle w:val="VerbatimChar"/>
-              </w:rPr>
               <w:lastRenderedPageBreak/>
-              <w:t>cs</w:t>
+              <w:t>blink_features/kinematics</w:t>
             </w:r>
           </w:p>
         </w:tc>
@@ -342,12 +351,7 @@
               <w:pStyle w:val="Compact"/>
             </w:pPr>
             <w:r>
-              <w:lastRenderedPageBreak/>
-              <w:t xml:space="preserve">Computes kinematic metrics </w:t>
-            </w:r>
-            <w:r>
-              <w:lastRenderedPageBreak/>
-              <w:t xml:space="preserve">(velocity, amplitude–velocity ratios, etc.). The </w:t>
+              <w:t xml:space="preserve">Computes kinematic metrics (velocity, amplitude–velocity ratios, etc.). The </w:t>
             </w:r>
             <w:r>
               <w:rPr>
@@ -387,12 +391,7 @@
               <w:pStyle w:val="Compact"/>
             </w:pPr>
             <w:r>
-              <w:lastRenderedPageBreak/>
-              <w:t xml:space="preserve">Similar loops and helper </w:t>
-            </w:r>
-            <w:r>
-              <w:lastRenderedPageBreak/>
-              <w:t xml:space="preserve">calls appear in morphology and energy features; </w:t>
+              <w:t xml:space="preserve">Similar loops and helper calls appear in morphology and energy features; </w:t>
             </w:r>
             <w:r>
               <w:rPr>
@@ -437,7 +436,6 @@
               <w:rPr>
                 <w:rStyle w:val="VerbatimChar"/>
               </w:rPr>
-              <w:lastRenderedPageBreak/>
               <w:t>blink_features/frequency_domain</w:t>
             </w:r>
           </w:p>
@@ -645,6 +643,7 @@
               <w:rPr>
                 <w:rStyle w:val="VerbatimChar"/>
               </w:rPr>
+              <w:lastRenderedPageBreak/>
               <w:t>_SHUT_AMP_FRACTION</w:t>
             </w:r>
             <w:r>
@@ -657,11 +656,7 @@
               <w:t>morphology/epoch_features.py</w:t>
             </w:r>
             <w:r>
-              <w:t xml:space="preserve"> and other </w:t>
-            </w:r>
-            <w:r>
-              <w:lastRenderedPageBreak/>
-              <w:t>places, leading to inconsistency and duplication.</w:t>
+              <w:t xml:space="preserve"> and other places, leading to inconsistency and duplication.</w:t>
             </w:r>
           </w:p>
         </w:tc>
@@ -844,7 +839,18 @@
         <w:t>Orchestration/compute loop repetition</w:t>
       </w:r>
       <w:r>
-        <w:t xml:space="preserve"> – The morphology, kinematic and frequency‑domain feature extractors share a nearly identical top‑level compute pipeline:</w:t>
+        <w:t xml:space="preserve"> – The morphology, </w:t>
+      </w:r>
+      <w:proofErr w:type="spellStart"/>
+      <w:r>
+        <w:t>kinematic</w:t>
+      </w:r>
+      <w:r>
+        <w:t>,energy</w:t>
+      </w:r>
+      <w:proofErr w:type="spellEnd"/>
+      <w:r>
+        <w:t xml:space="preserve"> and frequency‑domain feature extractors share a nearly identical top‑level compute pipeline:</w:t>
       </w:r>
     </w:p>
     <w:p>
@@ -970,6 +976,7 @@
         </w:numPr>
       </w:pPr>
       <w:r>
+        <w:lastRenderedPageBreak/>
         <w:t>Iterate over each epoch, extract metadata rows and compute per‑channel statistics via helper functions.</w:t>
       </w:r>
     </w:p>
@@ -978,7 +985,6 @@
         <w:pStyle w:val="FirstParagraph"/>
       </w:pPr>
       <w:r>
-        <w:lastRenderedPageBreak/>
         <w:t xml:space="preserve">Each module reimplements its own </w:t>
       </w:r>
       <w:r>
@@ -1376,7 +1382,11 @@
         <w:t>ear_energy_report.py</w:t>
       </w:r>
       <w:r>
-        <w:t xml:space="preserve"> appear to produce MATLAB‑style reports and plots; they are not referenced by the main pipeline or the tests. Similarly, </w:t>
+        <w:t xml:space="preserve"> appear to produce </w:t>
+      </w:r>
+      <w:r>
+        <w:lastRenderedPageBreak/>
+        <w:t xml:space="preserve">MATLAB‑style reports and plots; they are not referenced by the main pipeline or the tests. Similarly, </w:t>
       </w:r>
       <w:r>
         <w:rPr>
@@ -1403,11 +1413,7 @@
         <w:t>outside_annotation</w:t>
       </w:r>
       <w:r>
-        <w:t xml:space="preserve"> seem to implement alternative pipelines for annotation but </w:t>
-      </w:r>
-      <w:r>
-        <w:lastRenderedPageBreak/>
-        <w:t>are not imported anywhere else. These modules are candidates for quarantine or deletion after verifying they are not needed by external clients.</w:t>
+        <w:t xml:space="preserve"> seem to implement alternative pipelines for annotation but are not imported anywhere else. These modules are candidates for quarantine or deletion after verifying they are not needed by external clients.</w:t>
       </w:r>
     </w:p>
     <w:p>
@@ -1475,6 +1481,618 @@
     </w:p>
     <w:p>
       <w:pPr>
+        <w:numPr>
+          <w:ilvl w:val="0"/>
+          <w:numId w:val="6"/>
+        </w:numPr>
+        <w:rPr>
+          <w:lang w:val="en-US"/>
+        </w:rPr>
+      </w:pPr>
+      <w:r>
+        <w:t xml:space="preserve">In the </w:t>
+      </w:r>
+      <w:proofErr w:type="spellStart"/>
+      <w:r>
+        <w:rPr>
+          <w:lang w:val="en-US"/>
+        </w:rPr>
+        <w:t>slice_raw_into_mne_epochs_refine_annot</w:t>
+      </w:r>
+      <w:proofErr w:type="spellEnd"/>
+      <w:r>
+        <w:rPr>
+          <w:lang w:val="en-US"/>
+        </w:rPr>
+        <w:t xml:space="preserve">, the created metadata from </w:t>
+      </w:r>
+      <w:r>
+        <w:rPr>
+          <w:lang w:val="en-US"/>
+        </w:rPr>
+        <w:t xml:space="preserve">metadata = </w:t>
+      </w:r>
+      <w:proofErr w:type="spellStart"/>
+      <w:r>
+        <w:rPr>
+          <w:lang w:val="en-US"/>
+        </w:rPr>
+        <w:t>pd.DataFrame</w:t>
+      </w:r>
+      <w:proofErr w:type="spellEnd"/>
+      <w:r>
+        <w:rPr>
+          <w:lang w:val="en-US"/>
+        </w:rPr>
+        <w:t>(</w:t>
+      </w:r>
+      <w:proofErr w:type="spellStart"/>
+      <w:r>
+        <w:rPr>
+          <w:lang w:val="en-US"/>
+        </w:rPr>
+        <w:t>metadata_rows</w:t>
+      </w:r>
+      <w:proofErr w:type="spellEnd"/>
+      <w:r>
+        <w:rPr>
+          <w:lang w:val="en-US"/>
+        </w:rPr>
+        <w:t>)</w:t>
+      </w:r>
+      <w:r>
+        <w:rPr>
+          <w:lang w:val="en-US"/>
+        </w:rPr>
+        <w:t xml:space="preserve"> contain</w:t>
+      </w:r>
+      <w:r>
+        <w:rPr>
+          <w:lang w:val="en-US"/>
+        </w:rPr>
+        <w:t xml:space="preserve"> key that is not being use anymore such as </w:t>
+      </w:r>
+      <w:r>
+        <w:rPr>
+          <w:lang w:val="en-US"/>
+        </w:rPr>
+        <w:t>'</w:t>
+      </w:r>
+      <w:proofErr w:type="spellStart"/>
+      <w:r>
+        <w:rPr>
+          <w:lang w:val="en-US"/>
+        </w:rPr>
+        <w:t>blink_onset_eeg</w:t>
+      </w:r>
+      <w:proofErr w:type="spellEnd"/>
+      <w:r>
+        <w:rPr>
+          <w:lang w:val="en-US"/>
+        </w:rPr>
+        <w:t>'</w:t>
+      </w:r>
+      <w:r>
+        <w:rPr>
+          <w:lang w:val="en-US"/>
+        </w:rPr>
+        <w:t xml:space="preserve">, </w:t>
+      </w:r>
+      <w:r>
+        <w:rPr>
+          <w:lang w:val="en-US"/>
+        </w:rPr>
+        <w:t>'</w:t>
+      </w:r>
+      <w:proofErr w:type="spellStart"/>
+      <w:r>
+        <w:rPr>
+          <w:lang w:val="en-US"/>
+        </w:rPr>
+        <w:t>blink_duration_eeg</w:t>
+      </w:r>
+      <w:proofErr w:type="spellEnd"/>
+      <w:r>
+        <w:rPr>
+          <w:lang w:val="en-US"/>
+        </w:rPr>
+        <w:t>'</w:t>
+      </w:r>
+      <w:r>
+        <w:rPr>
+          <w:lang w:val="en-US"/>
+        </w:rPr>
+        <w:t xml:space="preserve">, </w:t>
+      </w:r>
+      <w:r>
+        <w:rPr>
+          <w:lang w:val="en-US"/>
+        </w:rPr>
+        <w:t>'</w:t>
+      </w:r>
+      <w:proofErr w:type="spellStart"/>
+      <w:r>
+        <w:rPr>
+          <w:lang w:val="en-US"/>
+        </w:rPr>
+        <w:t>blink_onset_extremum_eeg</w:t>
+      </w:r>
+      <w:proofErr w:type="spellEnd"/>
+      <w:r>
+        <w:rPr>
+          <w:lang w:val="en-US"/>
+        </w:rPr>
+        <w:t>'</w:t>
+      </w:r>
+      <w:r>
+        <w:rPr>
+          <w:lang w:val="en-US"/>
+        </w:rPr>
+        <w:t>,</w:t>
+      </w:r>
+      <w:r>
+        <w:t xml:space="preserve"> </w:t>
+      </w:r>
+      <w:r>
+        <w:rPr>
+          <w:lang w:val="en-US"/>
+        </w:rPr>
+        <w:t>'onset__refine__</w:t>
+      </w:r>
+      <w:proofErr w:type="spellStart"/>
+      <w:r>
+        <w:rPr>
+          <w:lang w:val="en-US"/>
+        </w:rPr>
+        <w:t>eeg</w:t>
+      </w:r>
+      <w:proofErr w:type="spellEnd"/>
+      <w:r>
+        <w:rPr>
+          <w:lang w:val="en-US"/>
+        </w:rPr>
+        <w:t>'</w:t>
+      </w:r>
+      <w:r>
+        <w:rPr>
+          <w:lang w:val="en-US"/>
+        </w:rPr>
+        <w:t>,</w:t>
+      </w:r>
+      <w:r>
+        <w:t xml:space="preserve"> </w:t>
+      </w:r>
+      <w:r>
+        <w:rPr>
+          <w:lang w:val="en-US"/>
+        </w:rPr>
+        <w:t>'duration__refine__</w:t>
+      </w:r>
+      <w:proofErr w:type="spellStart"/>
+      <w:r>
+        <w:rPr>
+          <w:lang w:val="en-US"/>
+        </w:rPr>
+        <w:t>eeg</w:t>
+      </w:r>
+      <w:proofErr w:type="spellEnd"/>
+      <w:r>
+        <w:rPr>
+          <w:lang w:val="en-US"/>
+        </w:rPr>
+        <w:t>'</w:t>
+      </w:r>
+      <w:r>
+        <w:rPr>
+          <w:lang w:val="en-US"/>
+        </w:rPr>
+        <w:t>,</w:t>
+      </w:r>
+      <w:r>
+        <w:t xml:space="preserve"> </w:t>
+      </w:r>
+      <w:r>
+        <w:rPr>
+          <w:lang w:val="en-US"/>
+        </w:rPr>
+        <w:t>'onset__refine_extremum__</w:t>
+      </w:r>
+      <w:proofErr w:type="spellStart"/>
+      <w:r>
+        <w:rPr>
+          <w:lang w:val="en-US"/>
+        </w:rPr>
+        <w:t>eeg</w:t>
+      </w:r>
+      <w:proofErr w:type="spellEnd"/>
+      <w:r>
+        <w:rPr>
+          <w:lang w:val="en-US"/>
+        </w:rPr>
+        <w:t>'</w:t>
+      </w:r>
+      <w:r>
+        <w:rPr>
+          <w:lang w:val="en-US"/>
+        </w:rPr>
+        <w:t>,</w:t>
+      </w:r>
+      <w:r>
+        <w:t xml:space="preserve"> </w:t>
+      </w:r>
+      <w:r>
+        <w:rPr>
+          <w:lang w:val="en-US"/>
+        </w:rPr>
+        <w:t>'</w:t>
+      </w:r>
+      <w:proofErr w:type="spellStart"/>
+      <w:r>
+        <w:rPr>
+          <w:lang w:val="en-US"/>
+        </w:rPr>
+        <w:t>blink_outer_start_eeg</w:t>
+      </w:r>
+      <w:proofErr w:type="spellEnd"/>
+      <w:r>
+        <w:rPr>
+          <w:lang w:val="en-US"/>
+        </w:rPr>
+        <w:t>'</w:t>
+      </w:r>
+      <w:r>
+        <w:rPr>
+          <w:lang w:val="en-US"/>
+        </w:rPr>
+        <w:t>,</w:t>
+      </w:r>
+      <w:r>
+        <w:t xml:space="preserve"> </w:t>
+      </w:r>
+      <w:r>
+        <w:rPr>
+          <w:lang w:val="en-US"/>
+        </w:rPr>
+        <w:t>'</w:t>
+      </w:r>
+      <w:proofErr w:type="spellStart"/>
+      <w:r>
+        <w:rPr>
+          <w:lang w:val="en-US"/>
+        </w:rPr>
+        <w:t>blink_outer_end_eeg</w:t>
+      </w:r>
+      <w:proofErr w:type="spellEnd"/>
+      <w:r>
+        <w:rPr>
+          <w:lang w:val="en-US"/>
+        </w:rPr>
+        <w:t>'</w:t>
+      </w:r>
+      <w:r>
+        <w:rPr>
+          <w:lang w:val="en-US"/>
+        </w:rPr>
+        <w:t>,</w:t>
+      </w:r>
+      <w:r>
+        <w:t xml:space="preserve"> </w:t>
+      </w:r>
+      <w:r>
+        <w:rPr>
+          <w:lang w:val="en-US"/>
+        </w:rPr>
+        <w:t>'onset__outer__</w:t>
+      </w:r>
+      <w:proofErr w:type="spellStart"/>
+      <w:r>
+        <w:rPr>
+          <w:lang w:val="en-US"/>
+        </w:rPr>
+        <w:t>eeg</w:t>
+      </w:r>
+      <w:proofErr w:type="spellEnd"/>
+      <w:r>
+        <w:rPr>
+          <w:lang w:val="en-US"/>
+        </w:rPr>
+        <w:t>'</w:t>
+      </w:r>
+      <w:r>
+        <w:rPr>
+          <w:lang w:val="en-US"/>
+        </w:rPr>
+        <w:t>,</w:t>
+      </w:r>
+      <w:r>
+        <w:t xml:space="preserve"> </w:t>
+      </w:r>
+      <w:r>
+        <w:rPr>
+          <w:lang w:val="en-US"/>
+        </w:rPr>
+        <w:t>'duration__outer__</w:t>
+      </w:r>
+      <w:proofErr w:type="spellStart"/>
+      <w:r>
+        <w:rPr>
+          <w:lang w:val="en-US"/>
+        </w:rPr>
+        <w:t>eeg</w:t>
+      </w:r>
+      <w:proofErr w:type="spellEnd"/>
+      <w:r>
+        <w:rPr>
+          <w:lang w:val="en-US"/>
+        </w:rPr>
+        <w:t>'</w:t>
+      </w:r>
+      <w:r>
+        <w:rPr>
+          <w:lang w:val="en-US"/>
+        </w:rPr>
+        <w:t>,</w:t>
+      </w:r>
+      <w:r>
+        <w:t xml:space="preserve"> </w:t>
+      </w:r>
+      <w:r>
+        <w:rPr>
+          <w:lang w:val="en-US"/>
+        </w:rPr>
+        <w:t>'</w:t>
+      </w:r>
+      <w:proofErr w:type="spellStart"/>
+      <w:r>
+        <w:rPr>
+          <w:lang w:val="en-US"/>
+        </w:rPr>
+        <w:t>blink_onset_eog</w:t>
+      </w:r>
+      <w:proofErr w:type="spellEnd"/>
+      <w:r>
+        <w:rPr>
+          <w:lang w:val="en-US"/>
+        </w:rPr>
+        <w:t>'</w:t>
+      </w:r>
+      <w:r>
+        <w:rPr>
+          <w:lang w:val="en-US"/>
+        </w:rPr>
+        <w:t>,</w:t>
+      </w:r>
+      <w:r>
+        <w:t xml:space="preserve"> </w:t>
+      </w:r>
+      <w:r>
+        <w:rPr>
+          <w:lang w:val="en-US"/>
+        </w:rPr>
+        <w:t>'</w:t>
+      </w:r>
+      <w:proofErr w:type="spellStart"/>
+      <w:r>
+        <w:rPr>
+          <w:lang w:val="en-US"/>
+        </w:rPr>
+        <w:t>blink_duration_eog</w:t>
+      </w:r>
+      <w:proofErr w:type="spellEnd"/>
+      <w:r>
+        <w:rPr>
+          <w:lang w:val="en-US"/>
+        </w:rPr>
+        <w:t>'</w:t>
+      </w:r>
+      <w:r>
+        <w:rPr>
+          <w:lang w:val="en-US"/>
+        </w:rPr>
+        <w:t>,</w:t>
+      </w:r>
+      <w:r>
+        <w:t xml:space="preserve"> </w:t>
+      </w:r>
+      <w:r>
+        <w:rPr>
+          <w:lang w:val="en-US"/>
+        </w:rPr>
+        <w:t>'blink_onset_extremum_</w:t>
+      </w:r>
+      <w:proofErr w:type="spellStart"/>
+      <w:r>
+        <w:rPr>
+          <w:lang w:val="en-US"/>
+        </w:rPr>
+        <w:t>eog</w:t>
+      </w:r>
+      <w:proofErr w:type="spellEnd"/>
+      <w:r>
+        <w:rPr>
+          <w:lang w:val="en-US"/>
+        </w:rPr>
+        <w:t>'</w:t>
+      </w:r>
+      <w:r>
+        <w:rPr>
+          <w:lang w:val="en-US"/>
+        </w:rPr>
+        <w:t>,</w:t>
+      </w:r>
+      <w:r>
+        <w:rPr>
+          <w:lang w:val="en-US"/>
+        </w:rPr>
+        <w:t>'duration__refine__</w:t>
+      </w:r>
+      <w:proofErr w:type="spellStart"/>
+      <w:r>
+        <w:rPr>
+          <w:lang w:val="en-US"/>
+        </w:rPr>
+        <w:t>eog</w:t>
+      </w:r>
+      <w:proofErr w:type="spellEnd"/>
+      <w:r>
+        <w:rPr>
+          <w:lang w:val="en-US"/>
+        </w:rPr>
+        <w:t>'</w:t>
+      </w:r>
+      <w:r>
+        <w:rPr>
+          <w:lang w:val="en-US"/>
+        </w:rPr>
+        <w:t>,</w:t>
+      </w:r>
+      <w:r>
+        <w:t xml:space="preserve"> </w:t>
+      </w:r>
+      <w:r>
+        <w:rPr>
+          <w:lang w:val="en-US"/>
+        </w:rPr>
+        <w:t>'onset__refine_extremum__</w:t>
+      </w:r>
+      <w:proofErr w:type="spellStart"/>
+      <w:r>
+        <w:rPr>
+          <w:lang w:val="en-US"/>
+        </w:rPr>
+        <w:t>eog</w:t>
+      </w:r>
+      <w:proofErr w:type="spellEnd"/>
+      <w:r>
+        <w:rPr>
+          <w:lang w:val="en-US"/>
+        </w:rPr>
+        <w:t>'</w:t>
+      </w:r>
+      <w:r>
+        <w:rPr>
+          <w:lang w:val="en-US"/>
+        </w:rPr>
+        <w:t>,</w:t>
+      </w:r>
+      <w:r>
+        <w:t xml:space="preserve"> </w:t>
+      </w:r>
+      <w:r>
+        <w:rPr>
+          <w:lang w:val="en-US"/>
+        </w:rPr>
+        <w:t>'</w:t>
+      </w:r>
+      <w:proofErr w:type="spellStart"/>
+      <w:r>
+        <w:rPr>
+          <w:lang w:val="en-US"/>
+        </w:rPr>
+        <w:t>blink_outer_start_eog</w:t>
+      </w:r>
+      <w:proofErr w:type="spellEnd"/>
+      <w:r>
+        <w:rPr>
+          <w:lang w:val="en-US"/>
+        </w:rPr>
+        <w:t>'</w:t>
+      </w:r>
+      <w:r>
+        <w:rPr>
+          <w:lang w:val="en-US"/>
+        </w:rPr>
+        <w:t>,</w:t>
+      </w:r>
+      <w:r>
+        <w:t xml:space="preserve"> </w:t>
+      </w:r>
+      <w:r>
+        <w:rPr>
+          <w:lang w:val="en-US"/>
+        </w:rPr>
+        <w:t>'</w:t>
+      </w:r>
+      <w:proofErr w:type="spellStart"/>
+      <w:r>
+        <w:rPr>
+          <w:lang w:val="en-US"/>
+        </w:rPr>
+        <w:t>blink_outer_end_eog</w:t>
+      </w:r>
+      <w:proofErr w:type="spellEnd"/>
+      <w:r>
+        <w:rPr>
+          <w:lang w:val="en-US"/>
+        </w:rPr>
+        <w:t>'</w:t>
+      </w:r>
+      <w:r>
+        <w:rPr>
+          <w:lang w:val="en-US"/>
+        </w:rPr>
+        <w:t>,</w:t>
+      </w:r>
+      <w:r>
+        <w:t xml:space="preserve"> </w:t>
+      </w:r>
+      <w:r>
+        <w:rPr>
+          <w:lang w:val="en-US"/>
+        </w:rPr>
+        <w:t>'onset__outer__</w:t>
+      </w:r>
+      <w:proofErr w:type="spellStart"/>
+      <w:r>
+        <w:rPr>
+          <w:lang w:val="en-US"/>
+        </w:rPr>
+        <w:t>eog</w:t>
+      </w:r>
+      <w:proofErr w:type="spellEnd"/>
+      <w:r>
+        <w:rPr>
+          <w:lang w:val="en-US"/>
+        </w:rPr>
+        <w:t>'</w:t>
+      </w:r>
+      <w:r>
+        <w:rPr>
+          <w:lang w:val="en-US"/>
+        </w:rPr>
+        <w:t>,</w:t>
+      </w:r>
+      <w:r>
+        <w:t xml:space="preserve"> </w:t>
+      </w:r>
+      <w:r>
+        <w:rPr>
+          <w:lang w:val="en-US"/>
+        </w:rPr>
+        <w:t>'duration__outer__</w:t>
+      </w:r>
+      <w:proofErr w:type="spellStart"/>
+      <w:r>
+        <w:rPr>
+          <w:lang w:val="en-US"/>
+        </w:rPr>
+        <w:t>eog</w:t>
+      </w:r>
+      <w:proofErr w:type="spellEnd"/>
+      <w:r>
+        <w:rPr>
+          <w:lang w:val="en-US"/>
+        </w:rPr>
+        <w:t>'</w:t>
+      </w:r>
+    </w:p>
+    <w:p>
+      <w:pPr>
+        <w:ind w:left="720"/>
+      </w:pPr>
+    </w:p>
+    <w:p>
+      <w:pPr>
         <w:pStyle w:val="Heading3"/>
       </w:pPr>
       <w:bookmarkStart w:id="11" w:name="complexity-readability-hotspots"/>
@@ -1600,7 +2218,11 @@
         <w:t>{modality}__{style}__{family}__{metric}_{stat}__{channel}</w:t>
       </w:r>
       <w:r>
-        <w:t>. Refactoring must preserve these column naming conventions unless a deliberate API change is made.</w:t>
+        <w:t xml:space="preserve">. Refactoring </w:t>
+      </w:r>
+      <w:r>
+        <w:lastRenderedPageBreak/>
+        <w:t>must preserve these column naming conventions unless a deliberate API change is made.</w:t>
       </w:r>
     </w:p>
     <w:p>
@@ -1620,7 +2242,18 @@
         <w:t>_add_legacy_ear_channel_aliases</w:t>
       </w:r>
       <w:r>
-        <w:t xml:space="preserve"> in kinematics). Removing or renaming these without deprecation warnings would break existing users.</w:t>
+        <w:t xml:space="preserve"> in kinematics). Removing or renaming these without deprecation warnings would break existing </w:t>
+      </w:r>
+      <w:proofErr w:type="spellStart"/>
+      <w:r>
+        <w:t>users.</w:t>
+      </w:r>
+      <w:r>
+        <w:t>But</w:t>
+      </w:r>
+      <w:proofErr w:type="spellEnd"/>
+      <w:r>
+        <w:t xml:space="preserve"> try to drop this</w:t>
       </w:r>
     </w:p>
     <w:p>
@@ -1754,11 +2387,7 @@
               <w:t>_STATS</w:t>
             </w:r>
             <w:r>
-              <w:t xml:space="preserve"> constants </w:t>
-            </w:r>
-            <w:r>
-              <w:lastRenderedPageBreak/>
-              <w:t>duplicated in morphology, kinematics, energy</w:t>
+              <w:t xml:space="preserve"> constants duplicated in morphology, kinematics, energy</w:t>
             </w:r>
           </w:p>
         </w:tc>
@@ -1775,15 +2404,10 @@
                 <w:b/>
                 <w:bCs/>
               </w:rPr>
-              <w:lastRenderedPageBreak/>
               <w:t>Merge</w:t>
             </w:r>
             <w:r>
-              <w:t xml:space="preserve"> into a single </w:t>
-            </w:r>
-            <w:r>
-              <w:lastRenderedPageBreak/>
-              <w:t xml:space="preserve">constant in a shared module (e.g., </w:t>
+              <w:t xml:space="preserve"> into a single constant in a shared module (e.g., </w:t>
             </w:r>
             <w:r>
               <w:rPr>
@@ -1805,12 +2429,7 @@
               <w:pStyle w:val="Compact"/>
             </w:pPr>
             <w:r>
-              <w:lastRenderedPageBreak/>
-              <w:t xml:space="preserve">Reduces </w:t>
-            </w:r>
-            <w:r>
-              <w:lastRenderedPageBreak/>
-              <w:t>duplication and guarantees consistent statistic names across families</w:t>
+              <w:t>Reduces duplication and guarantees consistent statistic names across families</w:t>
             </w:r>
           </w:p>
         </w:tc>
@@ -1823,7 +2442,6 @@
               <w:pStyle w:val="Compact"/>
             </w:pPr>
             <w:r>
-              <w:lastRenderedPageBreak/>
               <w:t>Low</w:t>
             </w:r>
           </w:p>
@@ -1837,11 +2455,7 @@
               <w:pStyle w:val="Compact"/>
             </w:pPr>
             <w:r>
-              <w:t xml:space="preserve">Verify that </w:t>
-            </w:r>
-            <w:r>
-              <w:lastRenderedPageBreak/>
-              <w:t>tests still see the same stats in column names</w:t>
+              <w:t>Verify that tests still see the same stats in column names</w:t>
             </w:r>
           </w:p>
         </w:tc>
@@ -1859,7 +2473,6 @@
               <w:rPr>
                 <w:rStyle w:val="VerbatimChar"/>
               </w:rPr>
-              <w:lastRenderedPageBreak/>
               <w:t>_available_styles</w:t>
             </w:r>
             <w:r>
@@ -2026,7 +2639,11 @@
               <w:pStyle w:val="Compact"/>
             </w:pPr>
             <w:r>
-              <w:t>Compare outputs of the new function with existing implementations on sample channel names</w:t>
+              <w:t xml:space="preserve">Compare outputs of the new function with existing implementations on </w:t>
+            </w:r>
+            <w:r>
+              <w:lastRenderedPageBreak/>
+              <w:t>sample channel names</w:t>
             </w:r>
           </w:p>
         </w:tc>
@@ -2044,6 +2661,7 @@
               <w:rPr>
                 <w:rStyle w:val="VerbatimChar"/>
               </w:rPr>
+              <w:lastRenderedPageBreak/>
               <w:t>_LEGACY_MORPHOLOGY_METRICS</w:t>
             </w:r>
             <w:r>
@@ -2127,11 +2745,7 @@
               <w:t>outside_annotation</w:t>
             </w:r>
             <w:r>
-              <w:t xml:space="preserve"> </w:t>
-            </w:r>
-            <w:r>
-              <w:lastRenderedPageBreak/>
-              <w:t>sub‑package</w:t>
+              <w:t xml:space="preserve"> sub‑package</w:t>
             </w:r>
           </w:p>
         </w:tc>
@@ -2148,15 +2762,10 @@
                 <w:b/>
                 <w:bCs/>
               </w:rPr>
-              <w:lastRenderedPageBreak/>
               <w:t>Remove/Quarantine</w:t>
             </w:r>
             <w:r>
-              <w:t xml:space="preserve"> if </w:t>
-            </w:r>
-            <w:r>
-              <w:lastRenderedPageBreak/>
-              <w:t>not used by API or tests</w:t>
+              <w:t xml:space="preserve"> if not used by API or tests</w:t>
             </w:r>
           </w:p>
         </w:tc>
@@ -2169,12 +2778,7 @@
               <w:pStyle w:val="Compact"/>
             </w:pPr>
             <w:r>
-              <w:lastRenderedPageBreak/>
-              <w:t xml:space="preserve">Appears to </w:t>
-            </w:r>
-            <w:r>
-              <w:lastRenderedPageBreak/>
-              <w:t>be dead code; deleting it simplifies the codebase</w:t>
+              <w:t>Appears to be dead code; deleting it simplifies the codebase</w:t>
             </w:r>
           </w:p>
         </w:tc>
@@ -2187,12 +2791,7 @@
               <w:pStyle w:val="Compact"/>
             </w:pPr>
             <w:r>
-              <w:lastRenderedPageBreak/>
-              <w:t>Mediu</w:t>
-            </w:r>
-            <w:r>
-              <w:lastRenderedPageBreak/>
-              <w:t>m</w:t>
+              <w:t>Medium</w:t>
             </w:r>
           </w:p>
         </w:tc>
@@ -2205,12 +2804,7 @@
               <w:pStyle w:val="Compact"/>
             </w:pPr>
             <w:r>
-              <w:lastRenderedPageBreak/>
-              <w:t xml:space="preserve">Search for </w:t>
-            </w:r>
-            <w:r>
-              <w:lastRenderedPageBreak/>
-              <w:t>external references; if uncertain, deprecate first and announce removal in release notes</w:t>
+              <w:t>Search for external references; if uncertain, deprecate first and announce removal in release notes</w:t>
             </w:r>
           </w:p>
         </w:tc>
@@ -2225,7 +2819,6 @@
               <w:pStyle w:val="Compact"/>
             </w:pPr>
             <w:r>
-              <w:lastRenderedPageBreak/>
               <w:t xml:space="preserve">Unused variables and commented code (e.g., </w:t>
             </w:r>
             <w:r>
@@ -2418,28 +3011,78 @@
           <w:b/>
           <w:bCs/>
         </w:rPr>
-        <w:t>Extract style/window helpers</w:t>
-      </w:r>
-      <w:r>
-        <w:t xml:space="preserve"> – Implement </w:t>
-      </w:r>
-      <w:r>
-        <w:rPr>
-          <w:rStyle w:val="VerbatimChar"/>
-        </w:rPr>
-        <w:t>utils.style_windows.available_styles(metadata_columns, modality, *, onset_prefix='onset__', duration_prefix='duration__')</w:t>
-      </w:r>
-      <w:r>
-        <w:t xml:space="preserve"> and </w:t>
-      </w:r>
-      <w:r>
-        <w:rPr>
-          <w:rStyle w:val="VerbatimChar"/>
-        </w:rPr>
-        <w:t>style_windows.extract_windows(metadata_row, modality, style, n_times, *, start_prefix='start__', end_prefix='end__')</w:t>
-      </w:r>
-      <w:r>
-        <w:t>. Parameterising prefixes allows reuse across families.</w:t>
+        <w:t>To delete, no excuse</w:t>
+      </w:r>
+    </w:p>
+    <w:p>
+      <w:pPr>
+        <w:ind w:left="720"/>
+      </w:pPr>
+      <w:r>
+        <w:rPr>
+          <w:rStyle w:val="VerbatimChar"/>
+        </w:rPr>
+        <w:lastRenderedPageBreak/>
+        <w:t xml:space="preserve">To delete the  as we are not going to use approach of ONSET and duration prefix &gt;&gt; </w:t>
+      </w:r>
+      <w:proofErr w:type="spellStart"/>
+      <w:r>
+        <w:rPr>
+          <w:rStyle w:val="VerbatimChar"/>
+        </w:rPr>
+        <w:t>utils.style_windows.available_styles</w:t>
+      </w:r>
+      <w:proofErr w:type="spellEnd"/>
+      <w:r>
+        <w:rPr>
+          <w:rStyle w:val="VerbatimChar"/>
+        </w:rPr>
+        <w:t>(</w:t>
+      </w:r>
+      <w:proofErr w:type="spellStart"/>
+      <w:r>
+        <w:rPr>
+          <w:rStyle w:val="VerbatimChar"/>
+        </w:rPr>
+        <w:t>metadata_columns</w:t>
+      </w:r>
+      <w:proofErr w:type="spellEnd"/>
+      <w:r>
+        <w:rPr>
+          <w:rStyle w:val="VerbatimChar"/>
+        </w:rPr>
+        <w:t xml:space="preserve">, modality, *, </w:t>
+      </w:r>
+      <w:proofErr w:type="spellStart"/>
+      <w:r>
+        <w:rPr>
+          <w:rStyle w:val="VerbatimChar"/>
+        </w:rPr>
+        <w:t>onset_prefix</w:t>
+      </w:r>
+      <w:proofErr w:type="spellEnd"/>
+      <w:r>
+        <w:rPr>
+          <w:rStyle w:val="VerbatimChar"/>
+        </w:rPr>
+        <w:t xml:space="preserve">='onset__', </w:t>
+      </w:r>
+      <w:proofErr w:type="spellStart"/>
+      <w:r>
+        <w:rPr>
+          <w:rStyle w:val="VerbatimChar"/>
+        </w:rPr>
+        <w:t>duration_prefix</w:t>
+      </w:r>
+      <w:proofErr w:type="spellEnd"/>
+      <w:r>
+        <w:rPr>
+          <w:rStyle w:val="VerbatimChar"/>
+        </w:rPr>
+        <w:t>='duration__')</w:t>
+      </w:r>
+      <w:r>
+        <w:t xml:space="preserve"> </w:t>
       </w:r>
     </w:p>
     <w:p>
@@ -2454,46 +3097,64 @@
           <w:b/>
           <w:bCs/>
         </w:rPr>
-        <w:t>Modularise kinematic feature code</w:t>
-      </w:r>
-      <w:r>
-        <w:t xml:space="preserve"> – Move low‑level functions such as </w:t>
-      </w:r>
-      <w:r>
-        <w:rPr>
-          <w:rStyle w:val="VerbatimChar"/>
-        </w:rPr>
-        <w:t>_coerce_numeric_list</w:t>
-      </w:r>
-      <w:r>
-        <w:t xml:space="preserve">, </w:t>
-      </w:r>
-      <w:r>
-        <w:rPr>
-          <w:rStyle w:val="VerbatimChar"/>
-        </w:rPr>
-        <w:t>_pad</w:t>
-      </w:r>
-      <w:r>
-        <w:t xml:space="preserve">, </w:t>
-      </w:r>
-      <w:r>
-        <w:rPr>
-          <w:rStyle w:val="VerbatimChar"/>
-        </w:rPr>
-        <w:t>_initialize_extended_columns</w:t>
-      </w:r>
-      <w:r>
-        <w:t xml:space="preserve"> and metric computations into a new </w:t>
-      </w:r>
-      <w:r>
-        <w:rPr>
-          <w:rStyle w:val="VerbatimChar"/>
-        </w:rPr>
-        <w:t>kinematics/helpers.py</w:t>
-      </w:r>
-      <w:r>
-        <w:t xml:space="preserve"> module. Mark internal helpers with a leading underscore and document them.</w:t>
+        <w:t>Extract style/window helpers</w:t>
+      </w:r>
+      <w:r>
+        <w:t xml:space="preserve"> – Implement </w:t>
+      </w:r>
+      <w:r>
+        <w:rPr>
+          <w:rStyle w:val="VerbatimChar"/>
+        </w:rPr>
+        <w:t>utils.style_windows.available_styles(metadata_columns, modality, *, onset_prefix='onset__', duration_prefix='duration__')</w:t>
+      </w:r>
+      <w:r>
+        <w:t xml:space="preserve"> and </w:t>
+      </w:r>
+      <w:proofErr w:type="spellStart"/>
+      <w:r>
+        <w:rPr>
+          <w:rStyle w:val="VerbatimChar"/>
+        </w:rPr>
+        <w:t>style_windows.extract_windows</w:t>
+      </w:r>
+      <w:proofErr w:type="spellEnd"/>
+      <w:r>
+        <w:rPr>
+          <w:rStyle w:val="VerbatimChar"/>
+        </w:rPr>
+        <w:t>(</w:t>
+      </w:r>
+      <w:proofErr w:type="spellStart"/>
+      <w:r>
+        <w:rPr>
+          <w:rStyle w:val="VerbatimChar"/>
+        </w:rPr>
+        <w:t>metadata_row</w:t>
+      </w:r>
+      <w:proofErr w:type="spellEnd"/>
+      <w:r>
+        <w:rPr>
+          <w:rStyle w:val="VerbatimChar"/>
+        </w:rPr>
+        <w:t xml:space="preserve">, modality, style, </w:t>
+      </w:r>
+      <w:proofErr w:type="spellStart"/>
+      <w:r>
+        <w:rPr>
+          <w:rStyle w:val="VerbatimChar"/>
+        </w:rPr>
+        <w:t>n_times</w:t>
+      </w:r>
+      <w:proofErr w:type="spellEnd"/>
+      <w:r>
+        <w:rPr>
+          <w:rStyle w:val="VerbatimChar"/>
+        </w:rPr>
+        <w:t>, *, start_prefix='start__', end_prefix='end__')</w:t>
+      </w:r>
+      <w:r>
+        <w:t>. Parameterising prefixes allows reuse across families.</w:t>
       </w:r>
     </w:p>
     <w:p>
@@ -2508,6 +3169,60 @@
           <w:b/>
           <w:bCs/>
         </w:rPr>
+        <w:t>Modularise kinematic feature code</w:t>
+      </w:r>
+      <w:r>
+        <w:t xml:space="preserve"> – Move low‑level functions such as </w:t>
+      </w:r>
+      <w:r>
+        <w:rPr>
+          <w:rStyle w:val="VerbatimChar"/>
+        </w:rPr>
+        <w:t>_coerce_numeric_list</w:t>
+      </w:r>
+      <w:r>
+        <w:t xml:space="preserve">, </w:t>
+      </w:r>
+      <w:r>
+        <w:rPr>
+          <w:rStyle w:val="VerbatimChar"/>
+        </w:rPr>
+        <w:t>_pad</w:t>
+      </w:r>
+      <w:r>
+        <w:t xml:space="preserve">, </w:t>
+      </w:r>
+      <w:r>
+        <w:rPr>
+          <w:rStyle w:val="VerbatimChar"/>
+        </w:rPr>
+        <w:t>_initialize_extended_columns</w:t>
+      </w:r>
+      <w:r>
+        <w:t xml:space="preserve"> and metric computations into a new </w:t>
+      </w:r>
+      <w:r>
+        <w:rPr>
+          <w:rStyle w:val="VerbatimChar"/>
+        </w:rPr>
+        <w:t>kinematics/helpers.py</w:t>
+      </w:r>
+      <w:r>
+        <w:t xml:space="preserve"> module. Mark internal helpers with a leading underscore and document them.</w:t>
+      </w:r>
+    </w:p>
+    <w:p>
+      <w:pPr>
+        <w:numPr>
+          <w:ilvl w:val="0"/>
+          <w:numId w:val="9"/>
+        </w:numPr>
+      </w:pPr>
+      <w:r>
+        <w:rPr>
+          <w:b/>
+          <w:bCs/>
+        </w:rPr>
         <w:t>Mark optional dependencies</w:t>
       </w:r>
       <w:r>
@@ -2539,7 +3254,6 @@
       <w:bookmarkStart w:id="16" w:name="X213a3f5c670069c3194bd9669321a325c392f50"/>
       <w:bookmarkEnd w:id="15"/>
       <w:r>
-        <w:lastRenderedPageBreak/>
         <w:t>Phase 2 – consolidation (shared loop skeletons &amp; config migration)</w:t>
       </w:r>
     </w:p>
@@ -2685,6 +3399,7 @@
       <w:bookmarkStart w:id="17" w:name="phase-3-api-cleanup-legacy-deprecation"/>
       <w:bookmarkEnd w:id="16"/>
       <w:r>
+        <w:lastRenderedPageBreak/>
         <w:t>Phase 3 – API cleanup &amp; legacy deprecation</w:t>
       </w:r>
     </w:p>
@@ -2804,231 +3519,231 @@
       <w:bookmarkEnd w:id="14"/>
       <w:bookmarkEnd w:id="17"/>
       <w:r>
+        <w:t>Design proposal: shared compute skeleton</w:t>
+      </w:r>
+    </w:p>
+    <w:p>
+      <w:pPr>
+        <w:pStyle w:val="SourceCode"/>
+      </w:pPr>
+      <w:r>
+        <w:rPr>
+          <w:rStyle w:val="VerbatimChar"/>
+        </w:rPr>
+        <w:t>from typing import Callable, Dict, Iterable, List, Sequence, Mapping</w:t>
+      </w:r>
+      <w:r>
+        <w:br/>
+      </w:r>
+      <w:r>
+        <w:rPr>
+          <w:rStyle w:val="VerbatimChar"/>
+        </w:rPr>
+        <w:t>import pandas as pd</w:t>
+      </w:r>
+      <w:r>
+        <w:br/>
+      </w:r>
+      <w:r>
+        <w:br/>
+      </w:r>
+      <w:r>
+        <w:rPr>
+          <w:rStyle w:val="VerbatimChar"/>
+        </w:rPr>
+        <w:t>def compute_features(</w:t>
+      </w:r>
+      <w:r>
+        <w:br/>
+      </w:r>
+      <w:r>
+        <w:rPr>
+          <w:rStyle w:val="VerbatimChar"/>
+        </w:rPr>
+        <w:t xml:space="preserve">    epochs: mne.Epochs,</w:t>
+      </w:r>
+      <w:r>
+        <w:br/>
+      </w:r>
+      <w:r>
+        <w:rPr>
+          <w:rStyle w:val="VerbatimChar"/>
+        </w:rPr>
+        <w:t xml:space="preserve">    picks: Sequence[str] | None,</w:t>
+      </w:r>
+      <w:r>
+        <w:br/>
+      </w:r>
+      <w:r>
+        <w:rPr>
+          <w:rStyle w:val="VerbatimChar"/>
+        </w:rPr>
+        <w:t xml:space="preserve">    metrics_by_style: Dict[str, Sequence[str]],</w:t>
+      </w:r>
+      <w:r>
+        <w:br/>
+      </w:r>
+      <w:r>
+        <w:rPr>
+          <w:rStyle w:val="VerbatimChar"/>
+        </w:rPr>
+        <w:t xml:space="preserve">    compute_func: Callable[[str, np.ndarray, float, str], Mapping[str, float]],</w:t>
+      </w:r>
+      <w:r>
+        <w:br/>
+      </w:r>
+      <w:r>
+        <w:rPr>
+          <w:rStyle w:val="VerbatimChar"/>
+        </w:rPr>
+        <w:t xml:space="preserve">    config: BlinkerConfig,</w:t>
+      </w:r>
+      <w:r>
+        <w:br/>
+      </w:r>
+      <w:r>
+        <w:rPr>
+          <w:rStyle w:val="VerbatimChar"/>
+        </w:rPr>
+        <w:t xml:space="preserve">    *,</w:t>
+      </w:r>
+      <w:r>
+        <w:br/>
+      </w:r>
+      <w:r>
+        <w:rPr>
+          <w:rStyle w:val="VerbatimChar"/>
+        </w:rPr>
+        <w:t xml:space="preserve">    family: str,</w:t>
+      </w:r>
+      <w:r>
+        <w:br/>
+      </w:r>
+      <w:r>
+        <w:rPr>
+          <w:rStyle w:val="VerbatimChar"/>
+        </w:rPr>
+        <w:t>) -&gt; pd.DataFrame:</w:t>
+      </w:r>
+      <w:r>
+        <w:br/>
+      </w:r>
+      <w:r>
+        <w:rPr>
+          <w:rStyle w:val="VerbatimChar"/>
+        </w:rPr>
+        <w:t xml:space="preserve">    """Shared orchestration logic for blink feature extraction.</w:t>
+      </w:r>
+      <w:r>
+        <w:br/>
+      </w:r>
+      <w:r>
+        <w:br/>
+      </w:r>
+      <w:r>
+        <w:rPr>
+          <w:rStyle w:val="VerbatimChar"/>
+        </w:rPr>
+        <w:t xml:space="preserve">    Parameters</w:t>
+      </w:r>
+      <w:r>
+        <w:br/>
+      </w:r>
+      <w:r>
+        <w:rPr>
+          <w:rStyle w:val="VerbatimChar"/>
+        </w:rPr>
+        <w:t xml:space="preserve">    ----------</w:t>
+      </w:r>
+      <w:r>
+        <w:br/>
+      </w:r>
+      <w:r>
+        <w:rPr>
+          <w:rStyle w:val="VerbatimChar"/>
+        </w:rPr>
+        <w:t xml:space="preserve">    epochs : mne.Epochs</w:t>
+      </w:r>
+      <w:r>
+        <w:br/>
+      </w:r>
+      <w:r>
+        <w:rPr>
+          <w:rStyle w:val="VerbatimChar"/>
+        </w:rPr>
+        <w:t xml:space="preserve">        MNE epochs object with metadata.</w:t>
+      </w:r>
+      <w:r>
+        <w:br/>
+      </w:r>
+      <w:r>
+        <w:rPr>
+          <w:rStyle w:val="VerbatimChar"/>
+        </w:rPr>
+        <w:t xml:space="preserve">    picks : list of str or None</w:t>
+      </w:r>
+      <w:r>
+        <w:br/>
+      </w:r>
+      <w:r>
+        <w:rPr>
+          <w:rStyle w:val="VerbatimChar"/>
+        </w:rPr>
+        <w:t xml:space="preserve">        Channels to process; if None, default channels are resolved.</w:t>
+      </w:r>
+      <w:r>
+        <w:br/>
+      </w:r>
+      <w:r>
+        <w:rPr>
+          <w:rStyle w:val="VerbatimChar"/>
+        </w:rPr>
+        <w:t xml:space="preserve">    metrics_by_style : dict</w:t>
+      </w:r>
+      <w:r>
+        <w:br/>
+      </w:r>
+      <w:r>
+        <w:rPr>
+          <w:rStyle w:val="VerbatimChar"/>
+        </w:rPr>
+        <w:t xml:space="preserve">        Maps style names to the list of metric names for that style.</w:t>
+      </w:r>
+      <w:r>
+        <w:br/>
+      </w:r>
+      <w:r>
+        <w:rPr>
+          <w:rStyle w:val="VerbatimChar"/>
+        </w:rPr>
+        <w:t xml:space="preserve">    compute_func : callable</w:t>
+      </w:r>
+      <w:r>
+        <w:br/>
+      </w:r>
+      <w:r>
+        <w:rPr>
+          <w:rStyle w:val="VerbatimChar"/>
+        </w:rPr>
+        <w:t xml:space="preserve">        Function called as `compute_func(style, segment, sfreq, modality)` to</w:t>
+      </w:r>
+      <w:r>
+        <w:br/>
+      </w:r>
+      <w:r>
+        <w:rPr>
+          <w:rStyle w:val="VerbatimChar"/>
+        </w:rPr>
+        <w:t xml:space="preserve">        compute metric values for a single segment.</w:t>
+      </w:r>
+      <w:r>
+        <w:br/>
+      </w:r>
+      <w:r>
+        <w:rPr>
+          <w:rStyle w:val="VerbatimChar"/>
+        </w:rPr>
         <w:lastRenderedPageBreak/>
-        <w:t>Design proposal: shared compute skeleton</w:t>
-      </w:r>
-    </w:p>
-    <w:p>
-      <w:pPr>
-        <w:pStyle w:val="SourceCode"/>
-      </w:pPr>
-      <w:r>
-        <w:rPr>
-          <w:rStyle w:val="VerbatimChar"/>
-        </w:rPr>
-        <w:t>from typing import Callable, Dict, Iterable, List, Sequence, Mapping</w:t>
-      </w:r>
-      <w:r>
-        <w:br/>
-      </w:r>
-      <w:r>
-        <w:rPr>
-          <w:rStyle w:val="VerbatimChar"/>
-        </w:rPr>
-        <w:t>import pandas as pd</w:t>
-      </w:r>
-      <w:r>
-        <w:br/>
-      </w:r>
-      <w:r>
-        <w:br/>
-      </w:r>
-      <w:r>
-        <w:rPr>
-          <w:rStyle w:val="VerbatimChar"/>
-        </w:rPr>
-        <w:t>def compute_features(</w:t>
-      </w:r>
-      <w:r>
-        <w:br/>
-      </w:r>
-      <w:r>
-        <w:rPr>
-          <w:rStyle w:val="VerbatimChar"/>
-        </w:rPr>
-        <w:t xml:space="preserve">    epochs: mne.Epochs,</w:t>
-      </w:r>
-      <w:r>
-        <w:br/>
-      </w:r>
-      <w:r>
-        <w:rPr>
-          <w:rStyle w:val="VerbatimChar"/>
-        </w:rPr>
-        <w:t xml:space="preserve">    picks: Sequence[str] | None,</w:t>
-      </w:r>
-      <w:r>
-        <w:br/>
-      </w:r>
-      <w:r>
-        <w:rPr>
-          <w:rStyle w:val="VerbatimChar"/>
-        </w:rPr>
-        <w:t xml:space="preserve">    metrics_by_style: Dict[str, Sequence[str]],</w:t>
-      </w:r>
-      <w:r>
-        <w:br/>
-      </w:r>
-      <w:r>
-        <w:rPr>
-          <w:rStyle w:val="VerbatimChar"/>
-        </w:rPr>
-        <w:t xml:space="preserve">    compute_func: Callable[[str, np.ndarray, float, str], Mapping[str, float]],</w:t>
-      </w:r>
-      <w:r>
-        <w:br/>
-      </w:r>
-      <w:r>
-        <w:rPr>
-          <w:rStyle w:val="VerbatimChar"/>
-        </w:rPr>
-        <w:t xml:space="preserve">    config: BlinkerConfig,</w:t>
-      </w:r>
-      <w:r>
-        <w:br/>
-      </w:r>
-      <w:r>
-        <w:rPr>
-          <w:rStyle w:val="VerbatimChar"/>
-        </w:rPr>
-        <w:t xml:space="preserve">    *,</w:t>
-      </w:r>
-      <w:r>
-        <w:br/>
-      </w:r>
-      <w:r>
-        <w:rPr>
-          <w:rStyle w:val="VerbatimChar"/>
-        </w:rPr>
-        <w:t xml:space="preserve">    family: str,</w:t>
-      </w:r>
-      <w:r>
-        <w:br/>
-      </w:r>
-      <w:r>
-        <w:rPr>
-          <w:rStyle w:val="VerbatimChar"/>
-        </w:rPr>
-        <w:t>) -&gt; pd.DataFrame:</w:t>
-      </w:r>
-      <w:r>
-        <w:br/>
-      </w:r>
-      <w:r>
-        <w:rPr>
-          <w:rStyle w:val="VerbatimChar"/>
-        </w:rPr>
-        <w:t xml:space="preserve">    """Shared orchestration logic for blink feature extraction.</w:t>
-      </w:r>
-      <w:r>
-        <w:br/>
-      </w:r>
-      <w:r>
-        <w:br/>
-      </w:r>
-      <w:r>
-        <w:rPr>
-          <w:rStyle w:val="VerbatimChar"/>
-        </w:rPr>
-        <w:t xml:space="preserve">    Parameters</w:t>
-      </w:r>
-      <w:r>
-        <w:br/>
-      </w:r>
-      <w:r>
-        <w:rPr>
-          <w:rStyle w:val="VerbatimChar"/>
-        </w:rPr>
-        <w:t xml:space="preserve">    ----------</w:t>
-      </w:r>
-      <w:r>
-        <w:br/>
-      </w:r>
-      <w:r>
-        <w:rPr>
-          <w:rStyle w:val="VerbatimChar"/>
-        </w:rPr>
-        <w:t xml:space="preserve">    epochs : mne.Epochs</w:t>
-      </w:r>
-      <w:r>
-        <w:br/>
-      </w:r>
-      <w:r>
-        <w:rPr>
-          <w:rStyle w:val="VerbatimChar"/>
-        </w:rPr>
-        <w:t xml:space="preserve">        MNE epochs object with metadata.</w:t>
-      </w:r>
-      <w:r>
-        <w:br/>
-      </w:r>
-      <w:r>
-        <w:rPr>
-          <w:rStyle w:val="VerbatimChar"/>
-        </w:rPr>
-        <w:t xml:space="preserve">    picks : list of str or None</w:t>
-      </w:r>
-      <w:r>
-        <w:br/>
-      </w:r>
-      <w:r>
-        <w:rPr>
-          <w:rStyle w:val="VerbatimChar"/>
-        </w:rPr>
-        <w:t xml:space="preserve">        Channels to process; if None, default channels are resolved.</w:t>
-      </w:r>
-      <w:r>
-        <w:br/>
-      </w:r>
-      <w:r>
-        <w:rPr>
-          <w:rStyle w:val="VerbatimChar"/>
-        </w:rPr>
-        <w:t xml:space="preserve">    metrics_by_style : dict</w:t>
-      </w:r>
-      <w:r>
-        <w:br/>
-      </w:r>
-      <w:r>
-        <w:rPr>
-          <w:rStyle w:val="VerbatimChar"/>
-        </w:rPr>
-        <w:t xml:space="preserve">        Maps style names to the list of metric names for that style.</w:t>
-      </w:r>
-      <w:r>
-        <w:br/>
-      </w:r>
-      <w:r>
-        <w:rPr>
-          <w:rStyle w:val="VerbatimChar"/>
-        </w:rPr>
-        <w:t xml:space="preserve">    compute_func : callable</w:t>
-      </w:r>
-      <w:r>
-        <w:br/>
-      </w:r>
-      <w:r>
-        <w:rPr>
-          <w:rStyle w:val="VerbatimChar"/>
-        </w:rPr>
-        <w:t xml:space="preserve">        Function called as `compute_func(style, segment, sfreq, modality)` to</w:t>
-      </w:r>
-      <w:r>
-        <w:br/>
-      </w:r>
-      <w:r>
-        <w:rPr>
-          <w:rStyle w:val="VerbatimChar"/>
-        </w:rPr>
-        <w:t xml:space="preserve">        compute metric values for a single segment.</w:t>
-      </w:r>
-      <w:r>
-        <w:br/>
-      </w:r>
-      <w:r>
-        <w:rPr>
-          <w:rStyle w:val="VerbatimChar"/>
-        </w:rPr>
         <w:t xml:space="preserve">    config : BlinkerConfig</w:t>
       </w:r>
       <w:r>
@@ -3212,241 +3927,241 @@
         <w:rPr>
           <w:rStyle w:val="VerbatimChar"/>
         </w:rPr>
+        <w:t xml:space="preserve">    # Build output columns</w:t>
+      </w:r>
+      <w:r>
+        <w:br/>
+      </w:r>
+      <w:r>
+        <w:rPr>
+          <w:rStyle w:val="VerbatimChar"/>
+        </w:rPr>
+        <w:t xml:space="preserve">    columns = []</w:t>
+      </w:r>
+      <w:r>
+        <w:br/>
+      </w:r>
+      <w:r>
+        <w:rPr>
+          <w:rStyle w:val="VerbatimChar"/>
+        </w:rPr>
+        <w:t xml:space="preserve">    for mod, channels in group_channels_by_modality(modality_map).items():</w:t>
+      </w:r>
+      <w:r>
+        <w:br/>
+      </w:r>
+      <w:r>
+        <w:rPr>
+          <w:rStyle w:val="VerbatimChar"/>
+        </w:rPr>
+        <w:t xml:space="preserve">        for style in styles_by_modality.get(mod, {"base"}):</w:t>
+      </w:r>
+      <w:r>
+        <w:br/>
+      </w:r>
+      <w:r>
+        <w:rPr>
+          <w:rStyle w:val="VerbatimChar"/>
+        </w:rPr>
+        <w:t xml:space="preserve">            for metric in metrics_by_style[style]:</w:t>
+      </w:r>
+      <w:r>
+        <w:br/>
+      </w:r>
+      <w:r>
+        <w:rPr>
+          <w:rStyle w:val="VerbatimChar"/>
+        </w:rPr>
+        <w:t xml:space="preserve">                for stat in config.stat_names:</w:t>
+      </w:r>
+      <w:r>
+        <w:br/>
+      </w:r>
+      <w:r>
+        <w:rPr>
+          <w:rStyle w:val="VerbatimChar"/>
+        </w:rPr>
+        <w:t xml:space="preserve">                    for ch in channels:</w:t>
+      </w:r>
+      <w:r>
+        <w:br/>
+      </w:r>
+      <w:r>
+        <w:rPr>
+          <w:rStyle w:val="VerbatimChar"/>
+        </w:rPr>
+        <w:t xml:space="preserve">                        columns.append(f"{mod}__{style}__{family}__{metric}_{stat}__{ch}")</w:t>
+      </w:r>
+      <w:r>
+        <w:br/>
+      </w:r>
+      <w:r>
+        <w:rPr>
+          <w:rStyle w:val="VerbatimChar"/>
+        </w:rPr>
+        <w:t xml:space="preserve">    # Compute per‑epoch records</w:t>
+      </w:r>
+      <w:r>
+        <w:br/>
+      </w:r>
+      <w:r>
+        <w:rPr>
+          <w:rStyle w:val="VerbatimChar"/>
+        </w:rPr>
+        <w:t xml:space="preserve">    records: List[Dict[str, float]] = []</w:t>
+      </w:r>
+      <w:r>
+        <w:br/>
+      </w:r>
+      <w:r>
+        <w:rPr>
+          <w:rStyle w:val="VerbatimChar"/>
+        </w:rPr>
+        <w:t xml:space="preserve">    for ei in range(n_epochs):</w:t>
+      </w:r>
+      <w:r>
+        <w:br/>
+      </w:r>
+      <w:r>
+        <w:rPr>
+          <w:rStyle w:val="VerbatimChar"/>
+        </w:rPr>
+        <w:t xml:space="preserve">        metadata_row = epochs.metadata.iloc[ei] if isinstance(</w:t>
+      </w:r>
+      <w:r>
+        <w:br/>
+      </w:r>
+      <w:r>
+        <w:rPr>
+          <w:rStyle w:val="VerbatimChar"/>
+        </w:rPr>
+        <w:t xml:space="preserve">            epochs.metadata, pd.DataFrame</w:t>
+      </w:r>
+      <w:r>
+        <w:br/>
+      </w:r>
+      <w:r>
+        <w:rPr>
+          <w:rStyle w:val="VerbatimChar"/>
+        </w:rPr>
+        <w:t xml:space="preserve">        ) else pd.Series(dtype=float)</w:t>
+      </w:r>
+      <w:r>
+        <w:br/>
+      </w:r>
+      <w:r>
+        <w:rPr>
+          <w:rStyle w:val="VerbatimChar"/>
+        </w:rPr>
+        <w:t xml:space="preserve">        record: Dict[str, float] = {}</w:t>
+      </w:r>
+      <w:r>
+        <w:br/>
+      </w:r>
+      <w:r>
+        <w:rPr>
+          <w:rStyle w:val="VerbatimChar"/>
+        </w:rPr>
+        <w:t xml:space="preserve">        for ch, mod in modality_map.items():</w:t>
+      </w:r>
+      <w:r>
+        <w:br/>
+      </w:r>
+      <w:r>
+        <w:rPr>
+          <w:rStyle w:val="VerbatimChar"/>
+        </w:rPr>
+        <w:t xml:space="preserve">            styles = styles_by_modality.get(mod, {"base"})</w:t>
+      </w:r>
+      <w:r>
+        <w:br/>
+      </w:r>
+      <w:r>
+        <w:rPr>
+          <w:rStyle w:val="VerbatimChar"/>
+        </w:rPr>
+        <w:t xml:space="preserve">            for style in styles:</w:t>
+      </w:r>
+      <w:r>
+        <w:br/>
+      </w:r>
+      <w:r>
+        <w:rPr>
+          <w:rStyle w:val="VerbatimChar"/>
+        </w:rPr>
+        <w:t xml:space="preserve">                windows = extract_windows(metadata_row, mod, style, n_times)</w:t>
+      </w:r>
+      <w:r>
+        <w:br/>
+      </w:r>
+      <w:r>
+        <w:rPr>
+          <w:rStyle w:val="VerbatimChar"/>
+        </w:rPr>
+        <w:t xml:space="preserve">                for start_idx, end_idx in windows:</w:t>
+      </w:r>
+      <w:r>
+        <w:br/>
+      </w:r>
+      <w:r>
+        <w:rPr>
+          <w:rStyle w:val="VerbatimChar"/>
+        </w:rPr>
+        <w:t xml:space="preserve">                    segment = channel_data[ch]['raw'][ei][start_idx:end_idx]</w:t>
+      </w:r>
+      <w:r>
+        <w:br/>
+      </w:r>
+      <w:r>
+        <w:rPr>
+          <w:rStyle w:val="VerbatimChar"/>
+        </w:rPr>
+        <w:t xml:space="preserve">                    stats = compute_func(style, segment, sfreq, mod)</w:t>
+      </w:r>
+      <w:r>
+        <w:br/>
+      </w:r>
+      <w:r>
+        <w:rPr>
+          <w:rStyle w:val="VerbatimChar"/>
+        </w:rPr>
+        <w:t xml:space="preserve">                    for metric, values in stats.items():</w:t>
+      </w:r>
+      <w:r>
+        <w:br/>
+      </w:r>
+      <w:r>
+        <w:rPr>
+          <w:rStyle w:val="VerbatimChar"/>
+        </w:rPr>
+        <w:t xml:space="preserve">                        for stat_name, val in values.items():</w:t>
+      </w:r>
+      <w:r>
+        <w:br/>
+      </w:r>
+      <w:r>
+        <w:rPr>
+          <w:rStyle w:val="VerbatimChar"/>
+        </w:rPr>
+        <w:t xml:space="preserve">                            col_name = f"{mod}__{style}__{family}__{metric}_{stat_name}__{ch}"</w:t>
+      </w:r>
+      <w:r>
+        <w:br/>
+      </w:r>
+      <w:r>
+        <w:rPr>
+          <w:rStyle w:val="VerbatimChar"/>
+        </w:rPr>
+        <w:t xml:space="preserve">                            record[col_name] = val</w:t>
+      </w:r>
+      <w:r>
+        <w:br/>
+      </w:r>
+      <w:r>
+        <w:rPr>
+          <w:rStyle w:val="VerbatimChar"/>
+        </w:rPr>
         <w:lastRenderedPageBreak/>
-        <w:t xml:space="preserve">    # Build output columns</w:t>
-      </w:r>
-      <w:r>
-        <w:br/>
-      </w:r>
-      <w:r>
-        <w:rPr>
-          <w:rStyle w:val="VerbatimChar"/>
-        </w:rPr>
-        <w:t xml:space="preserve">    columns = []</w:t>
-      </w:r>
-      <w:r>
-        <w:br/>
-      </w:r>
-      <w:r>
-        <w:rPr>
-          <w:rStyle w:val="VerbatimChar"/>
-        </w:rPr>
-        <w:t xml:space="preserve">    for mod, channels in group_channels_by_modality(modality_map).items():</w:t>
-      </w:r>
-      <w:r>
-        <w:br/>
-      </w:r>
-      <w:r>
-        <w:rPr>
-          <w:rStyle w:val="VerbatimChar"/>
-        </w:rPr>
-        <w:t xml:space="preserve">        for style in styles_by_modality.get(mod, {"base"}):</w:t>
-      </w:r>
-      <w:r>
-        <w:br/>
-      </w:r>
-      <w:r>
-        <w:rPr>
-          <w:rStyle w:val="VerbatimChar"/>
-        </w:rPr>
-        <w:t xml:space="preserve">            for metric in metrics_by_style[style]:</w:t>
-      </w:r>
-      <w:r>
-        <w:br/>
-      </w:r>
-      <w:r>
-        <w:rPr>
-          <w:rStyle w:val="VerbatimChar"/>
-        </w:rPr>
-        <w:t xml:space="preserve">                for stat in config.stat_names:</w:t>
-      </w:r>
-      <w:r>
-        <w:br/>
-      </w:r>
-      <w:r>
-        <w:rPr>
-          <w:rStyle w:val="VerbatimChar"/>
-        </w:rPr>
-        <w:t xml:space="preserve">                    for ch in channels:</w:t>
-      </w:r>
-      <w:r>
-        <w:br/>
-      </w:r>
-      <w:r>
-        <w:rPr>
-          <w:rStyle w:val="VerbatimChar"/>
-        </w:rPr>
-        <w:t xml:space="preserve">                        columns.append(f"{mod}__{style}__{family}__{metric}_{stat}__{ch}")</w:t>
-      </w:r>
-      <w:r>
-        <w:br/>
-      </w:r>
-      <w:r>
-        <w:rPr>
-          <w:rStyle w:val="VerbatimChar"/>
-        </w:rPr>
-        <w:t xml:space="preserve">    # Compute per‑epoch records</w:t>
-      </w:r>
-      <w:r>
-        <w:br/>
-      </w:r>
-      <w:r>
-        <w:rPr>
-          <w:rStyle w:val="VerbatimChar"/>
-        </w:rPr>
-        <w:t xml:space="preserve">    records: List[Dict[str, float]] = []</w:t>
-      </w:r>
-      <w:r>
-        <w:br/>
-      </w:r>
-      <w:r>
-        <w:rPr>
-          <w:rStyle w:val="VerbatimChar"/>
-        </w:rPr>
-        <w:t xml:space="preserve">    for ei in range(n_epochs):</w:t>
-      </w:r>
-      <w:r>
-        <w:br/>
-      </w:r>
-      <w:r>
-        <w:rPr>
-          <w:rStyle w:val="VerbatimChar"/>
-        </w:rPr>
-        <w:t xml:space="preserve">        metadata_row = epochs.metadata.iloc[ei] if isinstance(</w:t>
-      </w:r>
-      <w:r>
-        <w:br/>
-      </w:r>
-      <w:r>
-        <w:rPr>
-          <w:rStyle w:val="VerbatimChar"/>
-        </w:rPr>
-        <w:t xml:space="preserve">            epochs.metadata, pd.DataFrame</w:t>
-      </w:r>
-      <w:r>
-        <w:br/>
-      </w:r>
-      <w:r>
-        <w:rPr>
-          <w:rStyle w:val="VerbatimChar"/>
-        </w:rPr>
-        <w:t xml:space="preserve">        ) else pd.Series(dtype=float)</w:t>
-      </w:r>
-      <w:r>
-        <w:br/>
-      </w:r>
-      <w:r>
-        <w:rPr>
-          <w:rStyle w:val="VerbatimChar"/>
-        </w:rPr>
-        <w:t xml:space="preserve">        record: Dict[str, float] = {}</w:t>
-      </w:r>
-      <w:r>
-        <w:br/>
-      </w:r>
-      <w:r>
-        <w:rPr>
-          <w:rStyle w:val="VerbatimChar"/>
-        </w:rPr>
-        <w:t xml:space="preserve">        for ch, mod in modality_map.items():</w:t>
-      </w:r>
-      <w:r>
-        <w:br/>
-      </w:r>
-      <w:r>
-        <w:rPr>
-          <w:rStyle w:val="VerbatimChar"/>
-        </w:rPr>
-        <w:t xml:space="preserve">            styles = styles_by_modality.get(mod, {"base"})</w:t>
-      </w:r>
-      <w:r>
-        <w:br/>
-      </w:r>
-      <w:r>
-        <w:rPr>
-          <w:rStyle w:val="VerbatimChar"/>
-        </w:rPr>
-        <w:t xml:space="preserve">            for style in styles:</w:t>
-      </w:r>
-      <w:r>
-        <w:br/>
-      </w:r>
-      <w:r>
-        <w:rPr>
-          <w:rStyle w:val="VerbatimChar"/>
-        </w:rPr>
-        <w:t xml:space="preserve">                windows = extract_windows(metadata_row, mod, style, n_times)</w:t>
-      </w:r>
-      <w:r>
-        <w:br/>
-      </w:r>
-      <w:r>
-        <w:rPr>
-          <w:rStyle w:val="VerbatimChar"/>
-        </w:rPr>
-        <w:t xml:space="preserve">                for start_idx, end_idx in windows:</w:t>
-      </w:r>
-      <w:r>
-        <w:br/>
-      </w:r>
-      <w:r>
-        <w:rPr>
-          <w:rStyle w:val="VerbatimChar"/>
-        </w:rPr>
-        <w:t xml:space="preserve">                    segment = channel_data[ch]['raw'][ei][start_idx:end_idx]</w:t>
-      </w:r>
-      <w:r>
-        <w:br/>
-      </w:r>
-      <w:r>
-        <w:rPr>
-          <w:rStyle w:val="VerbatimChar"/>
-        </w:rPr>
-        <w:t xml:space="preserve">                    stats = compute_func(style, segment, sfreq, mod)</w:t>
-      </w:r>
-      <w:r>
-        <w:br/>
-      </w:r>
-      <w:r>
-        <w:rPr>
-          <w:rStyle w:val="VerbatimChar"/>
-        </w:rPr>
-        <w:t xml:space="preserve">                    for metric, values in stats.items():</w:t>
-      </w:r>
-      <w:r>
-        <w:br/>
-      </w:r>
-      <w:r>
-        <w:rPr>
-          <w:rStyle w:val="VerbatimChar"/>
-        </w:rPr>
-        <w:t xml:space="preserve">                        for stat_name, val in values.items():</w:t>
-      </w:r>
-      <w:r>
-        <w:br/>
-      </w:r>
-      <w:r>
-        <w:rPr>
-          <w:rStyle w:val="VerbatimChar"/>
-        </w:rPr>
-        <w:t xml:space="preserve">                            col_name = f"{mod}__{style}__{family}__{metric}_{stat_name}__{ch}"</w:t>
-      </w:r>
-      <w:r>
-        <w:br/>
-      </w:r>
-      <w:r>
-        <w:rPr>
-          <w:rStyle w:val="VerbatimChar"/>
-        </w:rPr>
-        <w:t xml:space="preserve">                            record[col_name] = val</w:t>
-      </w:r>
-      <w:r>
-        <w:br/>
-      </w:r>
-      <w:r>
-        <w:rPr>
-          <w:rStyle w:val="VerbatimChar"/>
-        </w:rPr>
         <w:t xml:space="preserve">        records.append(record)</w:t>
       </w:r>
       <w:r>
@@ -3649,11 +4364,7 @@
         <w:t>_DEFAULT_WAVEFORM_PARAMS</w:t>
       </w:r>
       <w:r>
-        <w:t xml:space="preserve">) with references to the config. Pass the config into compute functions so that thresholds are not </w:t>
-      </w:r>
-      <w:r>
-        <w:lastRenderedPageBreak/>
-        <w:t xml:space="preserve">hidden global state. Provide a global </w:t>
+        <w:t xml:space="preserve">) with references to the config. Pass the config into compute functions so that thresholds are not hidden global state. Provide a global </w:t>
       </w:r>
       <w:r>
         <w:rPr>
@@ -3809,6 +4520,7 @@
       <w:bookmarkStart w:id="21" w:name="risks-and-mitigations"/>
       <w:bookmarkEnd w:id="20"/>
       <w:r>
+        <w:lastRenderedPageBreak/>
         <w:t>Risks and mitigations</w:t>
       </w:r>
     </w:p>
@@ -4021,7 +4733,6 @@
               <w:pStyle w:val="Compact"/>
             </w:pPr>
             <w:r>
-              <w:lastRenderedPageBreak/>
               <w:t>Performance overhead from abstraction</w:t>
             </w:r>
           </w:p>
@@ -5005,7 +5716,6 @@
   <w:style w:type="character" w:default="1" w:styleId="DefaultParagraphFont">
     <w:name w:val="Default Paragraph Font"/>
     <w:uiPriority w:val="1"/>
-    <w:semiHidden/>
     <w:unhideWhenUsed/>
   </w:style>
   <w:style w:type="table" w:default="1" w:styleId="TableNormal">
@@ -5746,6 +6456,31 @@
     <w:rPr>
       <w:rFonts w:ascii="Consolas" w:hAnsi="Consolas"/>
       <w:sz w:val="22"/>
+    </w:rPr>
+  </w:style>
+  <w:style w:type="paragraph" w:styleId="HTMLPreformatted">
+    <w:name w:val="HTML Preformatted"/>
+    <w:basedOn w:val="Normal"/>
+    <w:link w:val="HTMLPreformattedChar"/>
+    <w:rsid w:val="00002BF4"/>
+    <w:pPr>
+      <w:spacing w:after="0"/>
+    </w:pPr>
+    <w:rPr>
+      <w:rFonts w:ascii="Consolas" w:hAnsi="Consolas"/>
+      <w:sz w:val="20"/>
+      <w:szCs w:val="20"/>
+    </w:rPr>
+  </w:style>
+  <w:style w:type="character" w:customStyle="1" w:styleId="HTMLPreformattedChar">
+    <w:name w:val="HTML Preformatted Char"/>
+    <w:basedOn w:val="DefaultParagraphFont"/>
+    <w:link w:val="HTMLPreformatted"/>
+    <w:rsid w:val="00002BF4"/>
+    <w:rPr>
+      <w:rFonts w:ascii="Consolas" w:hAnsi="Consolas"/>
+      <w:sz w:val="20"/>
+      <w:szCs w:val="20"/>
     </w:rPr>
   </w:style>
 </w:styles>

</xml_diff>